<commit_message>
Część 3: spis treści bez kolumny udziału %
Co-Authored-By: Claude Opus 5.5 <noreply@anthropic.com>
Claude-Session: https://claude.ai/code/session_01QehAftz7E7q6ro6WRzRWTg
</commit_message>
<xml_diff>
--- a/Czesc_3_Projekt_Toyota_Corolla_E12.docx
+++ b/Czesc_3_Projekt_Toyota_Corolla_E12.docx
@@ -172,7 +172,7 @@
     <w:p>
       <w:pPr>
         <w:tabs>
-          <w:tab w:val="right" w:pos="8338"/>
+          <w:tab w:val="right" w:pos="9638"/>
           <w:tab w:val="right" w:pos="9638"/>
         </w:tabs>
         <w:spacing w:after="60"/>
@@ -186,13 +186,13 @@
           <w:sz w:val="18"/>
           <w:szCs w:val="18"/>
         </w:rPr>
-        <w:t xml:space="preserve">	strona	udział</w:t>
+        <w:t xml:space="preserve">	strona</w:t>
       </w:r>
     </w:p>
     <w:p>
       <w:pPr>
         <w:tabs>
-          <w:tab w:val="right" w:pos="8338" w:leader="dot"/>
+          <w:tab w:val="right" w:pos="9638" w:leader="dot"/>
           <w:tab w:val="right" w:pos="9638"/>
         </w:tabs>
         <w:spacing w:after="70"/>
@@ -212,13 +212,13 @@
           <w:sz w:val="22"/>
           <w:szCs w:val="22"/>
         </w:rPr>
-        <w:t xml:space="preserve">	3	3%</w:t>
+        <w:t xml:space="preserve">	3</w:t>
       </w:r>
     </w:p>
     <w:p>
       <w:pPr>
         <w:tabs>
-          <w:tab w:val="right" w:pos="8338" w:leader="dot"/>
+          <w:tab w:val="right" w:pos="9638" w:leader="dot"/>
           <w:tab w:val="right" w:pos="9638"/>
         </w:tabs>
         <w:spacing w:after="70"/>
@@ -238,13 +238,13 @@
           <w:sz w:val="22"/>
           <w:szCs w:val="22"/>
         </w:rPr>
-        <w:t xml:space="preserve">	4	9%</w:t>
+        <w:t xml:space="preserve">	4</w:t>
       </w:r>
     </w:p>
     <w:p>
       <w:pPr>
         <w:tabs>
-          <w:tab w:val="right" w:pos="8338" w:leader="dot"/>
+          <w:tab w:val="right" w:pos="9638" w:leader="dot"/>
           <w:tab w:val="right" w:pos="9638"/>
         </w:tabs>
         <w:spacing w:after="70"/>
@@ -264,13 +264,13 @@
           <w:sz w:val="22"/>
           <w:szCs w:val="22"/>
         </w:rPr>
-        <w:t xml:space="preserve">	4	</w:t>
+        <w:t xml:space="preserve">	4</w:t>
       </w:r>
     </w:p>
     <w:p>
       <w:pPr>
         <w:tabs>
-          <w:tab w:val="right" w:pos="8338" w:leader="dot"/>
+          <w:tab w:val="right" w:pos="9638" w:leader="dot"/>
           <w:tab w:val="right" w:pos="9638"/>
         </w:tabs>
         <w:spacing w:after="70"/>
@@ -290,13 +290,13 @@
           <w:sz w:val="22"/>
           <w:szCs w:val="22"/>
         </w:rPr>
-        <w:t xml:space="preserve">	5	</w:t>
+        <w:t xml:space="preserve">	5</w:t>
       </w:r>
     </w:p>
     <w:p>
       <w:pPr>
         <w:tabs>
-          <w:tab w:val="right" w:pos="8338" w:leader="dot"/>
+          <w:tab w:val="right" w:pos="9638" w:leader="dot"/>
           <w:tab w:val="right" w:pos="9638"/>
         </w:tabs>
         <w:spacing w:after="70"/>
@@ -316,13 +316,13 @@
           <w:sz w:val="22"/>
           <w:szCs w:val="22"/>
         </w:rPr>
-        <w:t xml:space="preserve">	7	6%</w:t>
+        <w:t xml:space="preserve">	7</w:t>
       </w:r>
     </w:p>
     <w:p>
       <w:pPr>
         <w:tabs>
-          <w:tab w:val="right" w:pos="8338" w:leader="dot"/>
+          <w:tab w:val="right" w:pos="9638" w:leader="dot"/>
           <w:tab w:val="right" w:pos="9638"/>
         </w:tabs>
         <w:spacing w:after="70"/>
@@ -342,13 +342,13 @@
           <w:sz w:val="22"/>
           <w:szCs w:val="22"/>
         </w:rPr>
-        <w:t xml:space="preserve">	7	</w:t>
+        <w:t xml:space="preserve">	7</w:t>
       </w:r>
     </w:p>
     <w:p>
       <w:pPr>
         <w:tabs>
-          <w:tab w:val="right" w:pos="8338" w:leader="dot"/>
+          <w:tab w:val="right" w:pos="9638" w:leader="dot"/>
           <w:tab w:val="right" w:pos="9638"/>
         </w:tabs>
         <w:spacing w:after="70"/>
@@ -368,13 +368,13 @@
           <w:sz w:val="22"/>
           <w:szCs w:val="22"/>
         </w:rPr>
-        <w:t xml:space="preserve">	7	</w:t>
+        <w:t xml:space="preserve">	7</w:t>
       </w:r>
     </w:p>
     <w:p>
       <w:pPr>
         <w:tabs>
-          <w:tab w:val="right" w:pos="8338" w:leader="dot"/>
+          <w:tab w:val="right" w:pos="9638" w:leader="dot"/>
           <w:tab w:val="right" w:pos="9638"/>
         </w:tabs>
         <w:spacing w:after="70"/>
@@ -394,13 +394,13 @@
           <w:sz w:val="22"/>
           <w:szCs w:val="22"/>
         </w:rPr>
-        <w:t xml:space="preserve">	8	</w:t>
+        <w:t xml:space="preserve">	8</w:t>
       </w:r>
     </w:p>
     <w:p>
       <w:pPr>
         <w:tabs>
-          <w:tab w:val="right" w:pos="8338" w:leader="dot"/>
+          <w:tab w:val="right" w:pos="9638" w:leader="dot"/>
           <w:tab w:val="right" w:pos="9638"/>
         </w:tabs>
         <w:spacing w:after="70"/>
@@ -420,13 +420,13 @@
           <w:sz w:val="22"/>
           <w:szCs w:val="22"/>
         </w:rPr>
-        <w:t xml:space="preserve">	9	6%</w:t>
+        <w:t xml:space="preserve">	9</w:t>
       </w:r>
     </w:p>
     <w:p>
       <w:pPr>
         <w:tabs>
-          <w:tab w:val="right" w:pos="8338" w:leader="dot"/>
+          <w:tab w:val="right" w:pos="9638" w:leader="dot"/>
           <w:tab w:val="right" w:pos="9638"/>
         </w:tabs>
         <w:spacing w:after="70"/>
@@ -446,13 +446,13 @@
           <w:sz w:val="22"/>
           <w:szCs w:val="22"/>
         </w:rPr>
-        <w:t xml:space="preserve">	9	</w:t>
+        <w:t xml:space="preserve">	9</w:t>
       </w:r>
     </w:p>
     <w:p>
       <w:pPr>
         <w:tabs>
-          <w:tab w:val="right" w:pos="8338" w:leader="dot"/>
+          <w:tab w:val="right" w:pos="9638" w:leader="dot"/>
           <w:tab w:val="right" w:pos="9638"/>
         </w:tabs>
         <w:spacing w:after="70"/>
@@ -472,13 +472,13 @@
           <w:sz w:val="22"/>
           <w:szCs w:val="22"/>
         </w:rPr>
-        <w:t xml:space="preserve">	9	</w:t>
+        <w:t xml:space="preserve">	9</w:t>
       </w:r>
     </w:p>
     <w:p>
       <w:pPr>
         <w:tabs>
-          <w:tab w:val="right" w:pos="8338" w:leader="dot"/>
+          <w:tab w:val="right" w:pos="9638" w:leader="dot"/>
           <w:tab w:val="right" w:pos="9638"/>
         </w:tabs>
         <w:spacing w:after="70"/>
@@ -498,13 +498,13 @@
           <w:sz w:val="22"/>
           <w:szCs w:val="22"/>
         </w:rPr>
-        <w:t xml:space="preserve">	11	4%</w:t>
+        <w:t xml:space="preserve">	11</w:t>
       </w:r>
     </w:p>
     <w:p>
       <w:pPr>
         <w:tabs>
-          <w:tab w:val="right" w:pos="8338" w:leader="dot"/>
+          <w:tab w:val="right" w:pos="9638" w:leader="dot"/>
           <w:tab w:val="right" w:pos="9638"/>
         </w:tabs>
         <w:spacing w:after="70"/>
@@ -524,13 +524,13 @@
           <w:sz w:val="22"/>
           <w:szCs w:val="22"/>
         </w:rPr>
-        <w:t xml:space="preserve">	12	50%</w:t>
+        <w:t xml:space="preserve">	12</w:t>
       </w:r>
     </w:p>
     <w:p>
       <w:pPr>
         <w:tabs>
-          <w:tab w:val="right" w:pos="8338" w:leader="dot"/>
+          <w:tab w:val="right" w:pos="9638" w:leader="dot"/>
           <w:tab w:val="right" w:pos="9638"/>
         </w:tabs>
         <w:spacing w:after="70"/>
@@ -550,13 +550,13 @@
           <w:sz w:val="22"/>
           <w:szCs w:val="22"/>
         </w:rPr>
-        <w:t xml:space="preserve">	12	</w:t>
+        <w:t xml:space="preserve">	12</w:t>
       </w:r>
     </w:p>
     <w:p>
       <w:pPr>
         <w:tabs>
-          <w:tab w:val="right" w:pos="8338" w:leader="dot"/>
+          <w:tab w:val="right" w:pos="9638" w:leader="dot"/>
           <w:tab w:val="right" w:pos="9638"/>
         </w:tabs>
         <w:spacing w:after="70"/>
@@ -576,13 +576,13 @@
           <w:sz w:val="22"/>
           <w:szCs w:val="22"/>
         </w:rPr>
-        <w:t xml:space="preserve">	12	</w:t>
+        <w:t xml:space="preserve">	12</w:t>
       </w:r>
     </w:p>
     <w:p>
       <w:pPr>
         <w:tabs>
-          <w:tab w:val="right" w:pos="8338" w:leader="dot"/>
+          <w:tab w:val="right" w:pos="9638" w:leader="dot"/>
           <w:tab w:val="right" w:pos="9638"/>
         </w:tabs>
         <w:spacing w:after="70"/>
@@ -602,13 +602,13 @@
           <w:sz w:val="22"/>
           <w:szCs w:val="22"/>
         </w:rPr>
-        <w:t xml:space="preserve">		7%</w:t>
+        <w:t xml:space="preserve">	</w:t>
       </w:r>
     </w:p>
     <w:p>
       <w:pPr>
         <w:tabs>
-          <w:tab w:val="right" w:pos="8338" w:leader="dot"/>
+          <w:tab w:val="right" w:pos="9638" w:leader="dot"/>
           <w:tab w:val="right" w:pos="9638"/>
         </w:tabs>
         <w:spacing w:after="70"/>
@@ -628,13 +628,13 @@
           <w:sz w:val="22"/>
           <w:szCs w:val="22"/>
         </w:rPr>
-        <w:t xml:space="preserve">		</w:t>
+        <w:t xml:space="preserve">	</w:t>
       </w:r>
     </w:p>
     <w:p>
       <w:pPr>
         <w:tabs>
-          <w:tab w:val="right" w:pos="8338" w:leader="dot"/>
+          <w:tab w:val="right" w:pos="9638" w:leader="dot"/>
           <w:tab w:val="right" w:pos="9638"/>
         </w:tabs>
         <w:spacing w:after="70"/>
@@ -654,13 +654,13 @@
           <w:sz w:val="22"/>
           <w:szCs w:val="22"/>
         </w:rPr>
-        <w:t xml:space="preserve">		</w:t>
+        <w:t xml:space="preserve">	</w:t>
       </w:r>
     </w:p>
     <w:p>
       <w:pPr>
         <w:tabs>
-          <w:tab w:val="right" w:pos="8338" w:leader="dot"/>
+          <w:tab w:val="right" w:pos="9638" w:leader="dot"/>
           <w:tab w:val="right" w:pos="9638"/>
         </w:tabs>
         <w:spacing w:after="70"/>
@@ -680,13 +680,13 @@
           <w:sz w:val="22"/>
           <w:szCs w:val="22"/>
         </w:rPr>
-        <w:t xml:space="preserve">		</w:t>
+        <w:t xml:space="preserve">	</w:t>
       </w:r>
     </w:p>
     <w:p>
       <w:pPr>
         <w:tabs>
-          <w:tab w:val="right" w:pos="8338" w:leader="dot"/>
+          <w:tab w:val="right" w:pos="9638" w:leader="dot"/>
           <w:tab w:val="right" w:pos="9638"/>
         </w:tabs>
         <w:spacing w:after="70"/>
@@ -706,13 +706,13 @@
           <w:sz w:val="22"/>
           <w:szCs w:val="22"/>
         </w:rPr>
-        <w:t xml:space="preserve">		</w:t>
+        <w:t xml:space="preserve">	</w:t>
       </w:r>
     </w:p>
     <w:p>
       <w:pPr>
         <w:tabs>
-          <w:tab w:val="right" w:pos="8338" w:leader="dot"/>
+          <w:tab w:val="right" w:pos="9638" w:leader="dot"/>
           <w:tab w:val="right" w:pos="9638"/>
         </w:tabs>
         <w:spacing w:after="70"/>
@@ -732,13 +732,13 @@
           <w:sz w:val="22"/>
           <w:szCs w:val="22"/>
         </w:rPr>
-        <w:t xml:space="preserve">		4%</w:t>
+        <w:t xml:space="preserve">	</w:t>
       </w:r>
     </w:p>
     <w:p>
       <w:pPr>
         <w:tabs>
-          <w:tab w:val="right" w:pos="8338" w:leader="dot"/>
+          <w:tab w:val="right" w:pos="9638" w:leader="dot"/>
           <w:tab w:val="right" w:pos="9638"/>
         </w:tabs>
         <w:spacing w:after="70"/>
@@ -758,13 +758,13 @@
           <w:sz w:val="22"/>
           <w:szCs w:val="22"/>
         </w:rPr>
-        <w:t xml:space="preserve">		4%</w:t>
+        <w:t xml:space="preserve">	</w:t>
       </w:r>
     </w:p>
     <w:p>
       <w:pPr>
         <w:tabs>
-          <w:tab w:val="right" w:pos="8338" w:leader="dot"/>
+          <w:tab w:val="right" w:pos="9638" w:leader="dot"/>
           <w:tab w:val="right" w:pos="9638"/>
         </w:tabs>
         <w:spacing w:after="70"/>
@@ -784,13 +784,13 @@
           <w:sz w:val="22"/>
           <w:szCs w:val="22"/>
         </w:rPr>
-        <w:t xml:space="preserve">		</w:t>
+        <w:t xml:space="preserve">	</w:t>
       </w:r>
     </w:p>
     <w:p>
       <w:pPr>
         <w:tabs>
-          <w:tab w:val="right" w:pos="8338" w:leader="dot"/>
+          <w:tab w:val="right" w:pos="9638" w:leader="dot"/>
           <w:tab w:val="right" w:pos="9638"/>
         </w:tabs>
         <w:spacing w:after="70"/>
@@ -810,13 +810,13 @@
           <w:sz w:val="22"/>
           <w:szCs w:val="22"/>
         </w:rPr>
-        <w:t xml:space="preserve">		</w:t>
+        <w:t xml:space="preserve">	</w:t>
       </w:r>
     </w:p>
     <w:p>
       <w:pPr>
         <w:tabs>
-          <w:tab w:val="right" w:pos="8338" w:leader="dot"/>
+          <w:tab w:val="right" w:pos="9638" w:leader="dot"/>
           <w:tab w:val="right" w:pos="9638"/>
         </w:tabs>
         <w:spacing w:after="70"/>
@@ -836,13 +836,13 @@
           <w:sz w:val="22"/>
           <w:szCs w:val="22"/>
         </w:rPr>
-        <w:t xml:space="preserve">		</w:t>
+        <w:t xml:space="preserve">	</w:t>
       </w:r>
     </w:p>
     <w:p>
       <w:pPr>
         <w:tabs>
-          <w:tab w:val="right" w:pos="8338" w:leader="dot"/>
+          <w:tab w:val="right" w:pos="9638" w:leader="dot"/>
           <w:tab w:val="right" w:pos="9638"/>
         </w:tabs>
         <w:spacing w:after="70"/>
@@ -862,13 +862,13 @@
           <w:sz w:val="22"/>
           <w:szCs w:val="22"/>
         </w:rPr>
-        <w:t xml:space="preserve">		3%</w:t>
+        <w:t xml:space="preserve">	</w:t>
       </w:r>
     </w:p>
     <w:p>
       <w:pPr>
         <w:tabs>
-          <w:tab w:val="right" w:pos="8338" w:leader="dot"/>
+          <w:tab w:val="right" w:pos="9638" w:leader="dot"/>
           <w:tab w:val="right" w:pos="9638"/>
         </w:tabs>
         <w:spacing w:after="70"/>
@@ -888,25 +888,7 @@
           <w:sz w:val="22"/>
           <w:szCs w:val="22"/>
         </w:rPr>
-        <w:t xml:space="preserve">	13	4%</w:t>
-      </w:r>
-    </w:p>
-    <w:p>
-      <w:pPr>
-        <w:tabs>
-          <w:tab w:val="right" w:pos="9638"/>
-        </w:tabs>
-        <w:spacing w:before="80"/>
-      </w:pPr>
-      <w:r>
-        <w:rPr>
-          <w:rFonts w:ascii="Calibri" w:cs="Calibri" w:eastAsia="Calibri" w:hAnsi="Calibri"/>
-          <w:b/>
-          <w:bCs/>
-          <w:sz w:val="22"/>
-          <w:szCs w:val="22"/>
-        </w:rPr>
-        <w:t xml:space="preserve">Razem	100%</w:t>
+        <w:t xml:space="preserve">	13</w:t>
       </w:r>
     </w:p>
     <w:p>

</xml_diff>